<commit_message>
Reposition role from CTO to Tech Lead
Update the Makkinni LLC role and related copy across the site and CV
from "CTO" to "Tech Lead" to better reflect tenure and scope. Keeps
the Makkinni experience entry intact.
</commit_message>
<xml_diff>
--- a/public/Rami_Kanawati_CV.docx
+++ b/public/Rami_Kanawati_CV.docx
@@ -214,7 +214,7 @@
           <w:sz w:val="22"/>
           <w:szCs w:val="22"/>
         </w:rPr>
-        <w:t xml:space="preserve">. Comfortable across the full stack with React, Next.js, React Native, and TypeScript. Co-founder and CTO of an EdTech startup, with hands-on experience integrating GenAI and LLMs into business workflows. Agile/Scrum practitioner committed to clean code, SOLID principles, and test-driven development.</w:t>
+        <w:t xml:space="preserve">. Comfortable across the full stack with React, Next.js, React Native, and TypeScript. Co-founder and Tech Lead of an EdTech startup, with hands-on experience integrating GenAI and LLMs into business workflows. Agile/Scrum practitioner committed to clean code, SOLID principles, and test-driven development.</w:t>
       </w:r>
     </w:p>
     <w:p>
@@ -508,7 +508,7 @@
           <w:sz w:val="22"/>
           <w:szCs w:val="22"/>
         </w:rPr>
-        <w:t xml:space="preserve">Co-founder &amp; CTO</w:t>
+        <w:t xml:space="preserve">Co-founder &amp; Tech Lead</w:t>
       </w:r>
       <w:r>
         <w:rPr>

</xml_diff>